<commit_message>
Publish 1.8.46 and name the Intune action Upload.
</commit_message>
<xml_diff>
--- a/docs/InstallScout-guide.docx
+++ b/docs/InstallScout-guide.docx
@@ -23,7 +23,7 @@
           <w:color w:val="5B6B7C"/>
           <w:sz w:val="28"/>
         </w:rPr>
-        <w:t>User guide  ·  version 1.8.45</w:t>
+        <w:t>User guide  ·  version 1.8.46</w:t>
       </w:r>
     </w:p>
     <w:p>
@@ -444,7 +444,7 @@
           <w:color w:val="5B6B7C"/>
           <w:sz w:val="18"/>
         </w:rPr>
-        <w:t>Figure 1. InstallScout 1.8.45 — Drop an installer here, a short introduction, and buttons on two rows.</w:t>
+        <w:t>Figure 1. InstallScout 1.8.46 — Drop an installer here, a short introduction, and buttons on two rows.</w:t>
       </w:r>
     </w:p>
     <w:p>
@@ -717,7 +717,7 @@
                 <w:color w:val="1A1A1A"/>
                 <w:sz w:val="20"/>
               </w:rPr>
-              <w:t>Send to Intune…</w:t>
+              <w:t>Upload to Intune…</w:t>
             </w:r>
           </w:p>
         </w:tc>
@@ -862,7 +862,7 @@
           <w:color w:val="1A1A1A"/>
           <w:sz w:val="22"/>
         </w:rPr>
-        <w:t>Send to Intune — the dialog shows the whole form. One Edge profile is shown; open the field to pick another. Sign in, optionally choose supersedence, and upload.</w:t>
+        <w:t>Upload to Intune — the dialog shows the whole form. One Edge profile is shown; open the field to pick another. Sign in, optionally choose supersedence, and upload.</w:t>
       </w:r>
     </w:p>
     <w:p>
@@ -2269,7 +2269,7 @@
           <w:color w:val="1A1A1A"/>
           <w:sz w:val="22"/>
         </w:rPr>
-        <w:t>Intune Win32 must run as system or user. InstallScout infers context and shows it on the Intune tab and in Send to Intune. You can override it at upload.</w:t>
+        <w:t>Intune Win32 must run as system or user. InstallScout infers context and shows it on the Intune tab and in Upload to Intune. You can override it at upload.</w:t>
       </w:r>
     </w:p>
     <w:p>
@@ -2656,7 +2656,7 @@
           <w:color w:val="1A1A1A"/>
           <w:sz w:val="22"/>
         </w:rPr>
-        <w:t>Two steps: first a local .intunewin, then Send to Intune. The program uploads the package you already saved.</w:t>
+        <w:t>Two steps: first a local .intunewin, then Upload to Intune. The program uploads the package you already saved.</w:t>
       </w:r>
     </w:p>
     <w:p>
@@ -2672,7 +2672,7 @@
           <w:color w:val="113A5C"/>
           <w:sz w:val="18"/>
         </w:rPr>
-        <w:t>Analyze  →  optional extra switches  →  Intune package…  →  Send to Intune… (logo + Graph)</w:t>
+        <w:t>Analyze  →  optional extra switches  →  Intune package…  →  Upload to Intune… (logo + Graph)</w:t>
       </w:r>
     </w:p>
     <w:p>
@@ -2728,7 +2728,7 @@
           <w:color w:val="5B6B7C"/>
           <w:sz w:val="18"/>
         </w:rPr>
-        <w:t>Figure 8. Send to Intune is active when a local .intunewin exists.</w:t>
+        <w:t>Figure 8. Upload to Intune is active when a local .intunewin exists.</w:t>
       </w:r>
     </w:p>
     <w:p>
@@ -2786,7 +2786,7 @@
           <w:color w:val="1A1A1A"/>
           <w:sz w:val="22"/>
         </w:rPr>
-        <w:t>On Send to Intune the icon is extracted from the EXE (and logo.png / icon.ico next to the file, if present). Override with Choose file…, Paste (Ctrl+V) or Remove. MSI often only has a default icon.</w:t>
+        <w:t>On Upload to Intune the icon is extracted from the EXE (and logo.png / icon.ico next to the file, if present). Override with Choose file…, Paste (Ctrl+V) or Remove. MSI often only has a default icon.</w:t>
       </w:r>
     </w:p>
     <w:p>
@@ -2842,7 +2842,7 @@
           <w:color w:val="5B6B7C"/>
           <w:sz w:val="18"/>
         </w:rPr>
-        <w:t>Figure 9. App logo in Send to Intune: preview, Choose file, Paste, Remove.</w:t>
+        <w:t>Figure 9. App logo in Upload to Intune: preview, Choose file, Paste, Remove.</w:t>
       </w:r>
     </w:p>
     <w:p>
@@ -2954,7 +2954,7 @@
           <w:color w:val="1A1A1A"/>
           <w:sz w:val="22"/>
         </w:rPr>
-        <w:t>Send — creates the app, uploads .intunewin, sets detection, logo and optional supersedence.</w:t>
+        <w:t>Upload — creates the app, uploads .intunewin, sets detection, logo and optional supersedence.</w:t>
       </w:r>
     </w:p>
     <w:p>
@@ -3037,7 +3037,7 @@
           <w:color w:val="5B6B7C"/>
           <w:sz w:val="18"/>
         </w:rPr>
-        <w:t>Figure 10. Supersedence in Send to Intune: Git 2.50.0 selected, Update is the default.</w:t>
+        <w:t>Figure 10. Supersedence in Upload to Intune: Git 2.50.0 selected, Update is the default.</w:t>
       </w:r>
     </w:p>
     <w:p>
@@ -3789,7 +3789,7 @@
           <w:color w:val="1A1A1A"/>
           <w:sz w:val="22"/>
         </w:rPr>
-        <w:t>Context and EXE logo are qualified guesses. Override them in Send to Intune.</w:t>
+        <w:t>Context and EXE logo are qualified guesses. Override them in Upload to Intune.</w:t>
       </w:r>
     </w:p>
     <w:p>
@@ -3821,7 +3821,7 @@
           <w:color w:val="1A1A1A"/>
           <w:sz w:val="22"/>
         </w:rPr>
-        <w:t>Send to Intune is inactive until a local .intunewin exists.</w:t>
+        <w:t>Upload to Intune is inactive until a local .intunewin exists.</w:t>
       </w:r>
     </w:p>
     <w:p>
@@ -3898,7 +3898,7 @@
         <w:color w:val="5B6B7C"/>
         <w:sz w:val="16"/>
       </w:rPr>
-      <w:t>InstallScout 1.8.45  ·  internal user guide  ·  from installer to Intune</w:t>
+      <w:t>InstallScout 1.8.46  ·  internal user guide  ·  from installer to Intune</w:t>
     </w:r>
   </w:p>
 </w:ftr>

</xml_diff>

<commit_message>
List the Intune role and other prerequisites on the download page.
</commit_message>
<xml_diff>
--- a/docs/InstallScout-guide.docx
+++ b/docs/InstallScout-guide.docx
@@ -3628,7 +3628,7 @@
           <w:color w:val="1A1A1A"/>
           <w:sz w:val="22"/>
         </w:rPr>
-        <w:t>Entra user with DeviceManagementApps.ReadWrite.All.</w:t>
+        <w:t>An account that can create Win32 apps: Intune Administrator, or the Intune role Application Manager.</w:t>
       </w:r>
     </w:p>
     <w:p>
@@ -3644,7 +3644,7 @@
           <w:color w:val="1A1A1A"/>
           <w:sz w:val="22"/>
         </w:rPr>
-        <w:t>Default Client ID: Microsoft Graph PowerShell (14d82eec-204b-4c2f-b7e8-296a70dab67e).</w:t>
+        <w:t>Admin consent for DeviceManagementApps.ReadWrite.All. Default Client ID: Microsoft Graph PowerShell (14d82eec-204b-4c2f-b7e8-296a70dab67e).</w:t>
       </w:r>
     </w:p>
     <w:p>

</xml_diff>

<commit_message>
Document that the download is unsigned and can be tried in a VM.
</commit_message>
<xml_diff>
--- a/docs/InstallScout-guide.docx
+++ b/docs/InstallScout-guide.docx
@@ -377,6 +377,21 @@
           <w:sz w:val="22"/>
         </w:rPr>
         <w:t>Start: double-click InstallScoutPortable.exe or run Start.bat. The UI defaults to English.</w:t>
+      </w:r>
+    </w:p>
+    <w:p>
+      <w:pPr>
+        <w:spacing w:after="160" w:line="276" w:lineRule="auto"/>
+      </w:pPr>
+      <w:r>
+        <w:rPr>
+          <w:rFonts w:ascii="Calibri" w:hAnsi="Calibri" w:eastAsia="Calibri"/>
+          <w:b w:val="0"/>
+          <w:i w:val="0"/>
+          <w:color w:val="1A1A1A"/>
+          <w:sz w:val="22"/>
+        </w:rPr>
+        <w:t>The download is not code-signed. Windows or company security may warn or block it. Choose Keep / Run anyway, ask IT to allow the file, or try it in a VM or Windows Sandbox without those policies.</w:t>
       </w:r>
     </w:p>
     <w:p>
@@ -3757,6 +3772,22 @@
           <w:color w:val="1A1A1A"/>
           <w:sz w:val="22"/>
         </w:rPr>
+        <w:t>The download is not code-signed. Windows or company security may warn or block it. Choose Keep / Run anyway, ask IT to allow the file, or try it in a VM or Windows Sandbox without those policies.</w:t>
+      </w:r>
+    </w:p>
+    <w:p>
+      <w:pPr>
+        <w:pStyle w:val="ListBullet"/>
+        <w:spacing w:after="60"/>
+      </w:pPr>
+      <w:r>
+        <w:rPr>
+          <w:rFonts w:ascii="Calibri" w:hAnsi="Calibri" w:eastAsia="Calibri"/>
+          <w:b w:val="0"/>
+          <w:i w:val="0"/>
+          <w:color w:val="1A1A1A"/>
+          <w:sz w:val="22"/>
+        </w:rPr>
         <w:t>The program does not install anything. Unpack never runs the installer. Test in a VM.</w:t>
       </w:r>
     </w:p>

</xml_diff>

<commit_message>
Refresh screenshots for Upload to Intune and 1.8.47.
</commit_message>
<xml_diff>
--- a/docs/InstallScout-guide.docx
+++ b/docs/InstallScout-guide.docx
@@ -414,7 +414,7 @@
       <w:r>
         <w:drawing>
           <wp:inline xmlns:a="http://schemas.openxmlformats.org/drawingml/2006/main" xmlns:pic="http://schemas.openxmlformats.org/drawingml/2006/picture">
-            <wp:extent cx="5832000" cy="3439287"/>
+            <wp:extent cx="5832000" cy="3413391"/>
             <wp:docPr id="1" name="Picture 1"/>
             <wp:cNvGraphicFramePr>
               <a:graphicFrameLocks noChangeAspect="1"/>
@@ -435,7 +435,7 @@
                   <pic:spPr>
                     <a:xfrm>
                       <a:off x="0" y="0"/>
-                      <a:ext cx="5832000" cy="3439287"/>
+                      <a:ext cx="5832000" cy="3413391"/>
                     </a:xfrm>
                     <a:prstGeom prst="rect"/>
                   </pic:spPr>
@@ -1217,7 +1217,7 @@
       <w:r>
         <w:drawing>
           <wp:inline xmlns:a="http://schemas.openxmlformats.org/drawingml/2006/main" xmlns:pic="http://schemas.openxmlformats.org/drawingml/2006/picture">
-            <wp:extent cx="5832000" cy="3439287"/>
+            <wp:extent cx="5832000" cy="3413391"/>
             <wp:docPr id="2" name="Picture 2"/>
             <wp:cNvGraphicFramePr>
               <a:graphicFrameLocks noChangeAspect="1"/>
@@ -1238,7 +1238,7 @@
                   <pic:spPr>
                     <a:xfrm>
                       <a:off x="0" y="0"/>
-                      <a:ext cx="5832000" cy="3439287"/>
+                      <a:ext cx="5832000" cy="3413391"/>
                     </a:xfrm>
                     <a:prstGeom prst="rect"/>
                   </pic:spPr>
@@ -1736,7 +1736,7 @@
       <w:r>
         <w:drawing>
           <wp:inline xmlns:a="http://schemas.openxmlformats.org/drawingml/2006/main" xmlns:pic="http://schemas.openxmlformats.org/drawingml/2006/picture">
-            <wp:extent cx="5832000" cy="3439287"/>
+            <wp:extent cx="5832000" cy="3413391"/>
             <wp:docPr id="3" name="Picture 3"/>
             <wp:cNvGraphicFramePr>
               <a:graphicFrameLocks noChangeAspect="1"/>
@@ -1757,7 +1757,7 @@
                   <pic:spPr>
                     <a:xfrm>
                       <a:off x="0" y="0"/>
-                      <a:ext cx="5832000" cy="3439287"/>
+                      <a:ext cx="5832000" cy="3413391"/>
                     </a:xfrm>
                     <a:prstGeom prst="rect"/>
                   </pic:spPr>
@@ -2197,7 +2197,7 @@
       <w:r>
         <w:drawing>
           <wp:inline xmlns:a="http://schemas.openxmlformats.org/drawingml/2006/main" xmlns:pic="http://schemas.openxmlformats.org/drawingml/2006/picture">
-            <wp:extent cx="5832000" cy="3439287"/>
+            <wp:extent cx="5832000" cy="3413391"/>
             <wp:docPr id="5" name="Picture 5"/>
             <wp:cNvGraphicFramePr>
               <a:graphicFrameLocks noChangeAspect="1"/>
@@ -2218,7 +2218,7 @@
                   <pic:spPr>
                     <a:xfrm>
                       <a:off x="0" y="0"/>
-                      <a:ext cx="5832000" cy="3439287"/>
+                      <a:ext cx="5832000" cy="3413391"/>
                     </a:xfrm>
                     <a:prstGeom prst="rect"/>
                   </pic:spPr>
@@ -2359,7 +2359,7 @@
       <w:r>
         <w:drawing>
           <wp:inline xmlns:a="http://schemas.openxmlformats.org/drawingml/2006/main" xmlns:pic="http://schemas.openxmlformats.org/drawingml/2006/picture">
-            <wp:extent cx="5832000" cy="3439287"/>
+            <wp:extent cx="5832000" cy="3413391"/>
             <wp:docPr id="6" name="Picture 6"/>
             <wp:cNvGraphicFramePr>
               <a:graphicFrameLocks noChangeAspect="1"/>
@@ -2380,7 +2380,7 @@
                   <pic:spPr>
                     <a:xfrm>
                       <a:off x="0" y="0"/>
-                      <a:ext cx="5832000" cy="3439287"/>
+                      <a:ext cx="5832000" cy="3413391"/>
                     </a:xfrm>
                     <a:prstGeom prst="rect"/>
                   </pic:spPr>
@@ -2415,7 +2415,7 @@
       <w:r>
         <w:drawing>
           <wp:inline xmlns:a="http://schemas.openxmlformats.org/drawingml/2006/main" xmlns:pic="http://schemas.openxmlformats.org/drawingml/2006/picture">
-            <wp:extent cx="5832000" cy="3439287"/>
+            <wp:extent cx="5832000" cy="3413391"/>
             <wp:docPr id="7" name="Picture 7"/>
             <wp:cNvGraphicFramePr>
               <a:graphicFrameLocks noChangeAspect="1"/>
@@ -2436,7 +2436,7 @@
                   <pic:spPr>
                     <a:xfrm>
                       <a:off x="0" y="0"/>
-                      <a:ext cx="5832000" cy="3439287"/>
+                      <a:ext cx="5832000" cy="3413391"/>
                     </a:xfrm>
                     <a:prstGeom prst="rect"/>
                   </pic:spPr>
@@ -2698,7 +2698,7 @@
       <w:r>
         <w:drawing>
           <wp:inline xmlns:a="http://schemas.openxmlformats.org/drawingml/2006/main" xmlns:pic="http://schemas.openxmlformats.org/drawingml/2006/picture">
-            <wp:extent cx="5832000" cy="3439287"/>
+            <wp:extent cx="5832000" cy="3413391"/>
             <wp:docPr id="8" name="Picture 8"/>
             <wp:cNvGraphicFramePr>
               <a:graphicFrameLocks noChangeAspect="1"/>
@@ -2719,7 +2719,7 @@
                   <pic:spPr>
                     <a:xfrm>
                       <a:off x="0" y="0"/>
-                      <a:ext cx="5832000" cy="3439287"/>
+                      <a:ext cx="5832000" cy="3413391"/>
                     </a:xfrm>
                     <a:prstGeom prst="rect"/>
                   </pic:spPr>
@@ -2812,7 +2812,7 @@
       <w:r>
         <w:drawing>
           <wp:inline xmlns:a="http://schemas.openxmlformats.org/drawingml/2006/main" xmlns:pic="http://schemas.openxmlformats.org/drawingml/2006/picture">
-            <wp:extent cx="4140000" cy="5358586"/>
+            <wp:extent cx="4140000" cy="5329716"/>
             <wp:docPr id="9" name="Picture 9"/>
             <wp:cNvGraphicFramePr>
               <a:graphicFrameLocks noChangeAspect="1"/>
@@ -2833,7 +2833,7 @@
                   <pic:spPr>
                     <a:xfrm>
                       <a:off x="0" y="0"/>
-                      <a:ext cx="4140000" cy="5358586"/>
+                      <a:ext cx="4140000" cy="5329716"/>
                     </a:xfrm>
                     <a:prstGeom prst="rect"/>
                   </pic:spPr>
@@ -3007,7 +3007,7 @@
       <w:r>
         <w:drawing>
           <wp:inline xmlns:a="http://schemas.openxmlformats.org/drawingml/2006/main" xmlns:pic="http://schemas.openxmlformats.org/drawingml/2006/picture">
-            <wp:extent cx="5832000" cy="1709121"/>
+            <wp:extent cx="5832000" cy="1713526"/>
             <wp:docPr id="10" name="Picture 10"/>
             <wp:cNvGraphicFramePr>
               <a:graphicFrameLocks noChangeAspect="1"/>
@@ -3028,7 +3028,7 @@
                   <pic:spPr>
                     <a:xfrm>
                       <a:off x="0" y="0"/>
-                      <a:ext cx="5832000" cy="1709121"/>
+                      <a:ext cx="5832000" cy="1713526"/>
                     </a:xfrm>
                     <a:prstGeom prst="rect"/>
                   </pic:spPr>

</xml_diff>

<commit_message>
Publish 1.8.48 with the About dialog.
</commit_message>
<xml_diff>
--- a/docs/InstallScout-guide.docx
+++ b/docs/InstallScout-guide.docx
@@ -23,7 +23,7 @@
           <w:color w:val="5B6B7C"/>
           <w:sz w:val="28"/>
         </w:rPr>
-        <w:t>User guide  ·  version 1.8.47</w:t>
+        <w:t>User guide  ·  version 1.8.48</w:t>
       </w:r>
     </w:p>
     <w:p>
@@ -376,7 +376,7 @@
           <w:color w:val="1A1A1A"/>
           <w:sz w:val="22"/>
         </w:rPr>
-        <w:t>Start: double-click InstallScoutPortable.exe or run Start.bat. The UI defaults to English.</w:t>
+        <w:t>Start: double-click InstallScoutPortable.exe or run Start.bat. The UI defaults to English. About… shows the version, developer, and GitHub links.</w:t>
       </w:r>
     </w:p>
     <w:p>
@@ -459,7 +459,7 @@
           <w:color w:val="5B6B7C"/>
           <w:sz w:val="18"/>
         </w:rPr>
-        <w:t>Figure 1. InstallScout 1.8.47 — Drop an installer here, a short introduction, and buttons on two rows.</w:t>
+        <w:t>Figure 1. InstallScout 1.8.48 — Drop an installer here, a short introduction, and buttons on two rows.</w:t>
       </w:r>
     </w:p>
     <w:p>
@@ -3929,7 +3929,7 @@
         <w:color w:val="5B6B7C"/>
         <w:sz w:val="16"/>
       </w:rPr>
-      <w:t>InstallScout 1.8.47  ·  internal user guide  ·  from installer to Intune</w:t>
+      <w:t>InstallScout 1.8.48  ·  internal user guide  ·  from installer to Intune</w:t>
     </w:r>
   </w:p>
 </w:ftr>

</xml_diff>

<commit_message>
Publish 1.8.49 with publisher mthorngaard.
</commit_message>
<xml_diff>
--- a/docs/InstallScout-guide.docx
+++ b/docs/InstallScout-guide.docx
@@ -23,7 +23,7 @@
           <w:color w:val="5B6B7C"/>
           <w:sz w:val="28"/>
         </w:rPr>
-        <w:t>User guide  ·  version 1.8.48</w:t>
+        <w:t>User guide  ·  version 1.8.49</w:t>
       </w:r>
     </w:p>
     <w:p>
@@ -459,7 +459,7 @@
           <w:color w:val="5B6B7C"/>
           <w:sz w:val="18"/>
         </w:rPr>
-        <w:t>Figure 1. InstallScout 1.8.48 — Drop an installer here, a short introduction, and buttons on two rows.</w:t>
+        <w:t>Figure 1. InstallScout 1.8.49 — Drop an installer here, a short introduction, and buttons on two rows.</w:t>
       </w:r>
     </w:p>
     <w:p>
@@ -3929,7 +3929,7 @@
         <w:color w:val="5B6B7C"/>
         <w:sz w:val="16"/>
       </w:rPr>
-      <w:t>InstallScout 1.8.48  ·  internal user guide  ·  from installer to Intune</w:t>
+      <w:t>InstallScout 1.8.49  ·  internal user guide  ·  from installer to Intune</w:t>
     </w:r>
   </w:p>
 </w:ftr>

</xml_diff>

<commit_message>
Publish 1.8.50 with bundled 7-Zip Extra for unpack.
</commit_message>
<xml_diff>
--- a/docs/InstallScout-guide.docx
+++ b/docs/InstallScout-guide.docx
@@ -23,7 +23,7 @@
           <w:color w:val="5B6B7C"/>
           <w:sz w:val="28"/>
         </w:rPr>
-        <w:t>User guide  ·  version 1.8.49</w:t>
+        <w:t>User guide  ·  version 1.8.50</w:t>
       </w:r>
     </w:p>
     <w:p>
@@ -459,7 +459,7 @@
           <w:color w:val="5B6B7C"/>
           <w:sz w:val="18"/>
         </w:rPr>
-        <w:t>Figure 1. InstallScout 1.8.49 — Drop an installer here, a short introduction, and buttons on two rows.</w:t>
+        <w:t>Figure 1. InstallScout 1.8.50 — Drop an installer here, a short introduction, and buttons on two rows.</w:t>
       </w:r>
     </w:p>
     <w:p>
@@ -3929,7 +3929,7 @@
         <w:color w:val="5B6B7C"/>
         <w:sz w:val="16"/>
       </w:rPr>
-      <w:t>InstallScout 1.8.49  ·  internal user guide  ·  from installer to Intune</w:t>
+      <w:t>InstallScout 1.8.50  ·  internal user guide  ·  from installer to Intune</w:t>
     </w:r>
   </w:p>
 </w:ftr>

</xml_diff>

<commit_message>
Publish 1.8.51 with Dark/Light theme toggle.
</commit_message>
<xml_diff>
--- a/docs/InstallScout-guide.docx
+++ b/docs/InstallScout-guide.docx
@@ -23,7 +23,7 @@
           <w:color w:val="5B6B7C"/>
           <w:sz w:val="28"/>
         </w:rPr>
-        <w:t>User guide  ·  version 1.8.50</w:t>
+        <w:t>User guide  ·  version 1.8.51</w:t>
       </w:r>
     </w:p>
     <w:p>
@@ -459,7 +459,7 @@
           <w:color w:val="5B6B7C"/>
           <w:sz w:val="18"/>
         </w:rPr>
-        <w:t>Figure 1. InstallScout 1.8.50 — Drop an installer here, a short introduction, and buttons on two rows.</w:t>
+        <w:t>Figure 1. InstallScout 1.8.51 — Drop an installer here, a short introduction, and buttons on two rows.</w:t>
       </w:r>
     </w:p>
     <w:p>
@@ -3929,7 +3929,7 @@
         <w:color w:val="5B6B7C"/>
         <w:sz w:val="16"/>
       </w:rPr>
-      <w:t>InstallScout 1.8.50  ·  internal user guide  ·  from installer to Intune</w:t>
+      <w:t>InstallScout 1.8.51  ·  internal user guide  ·  from installer to Intune</w:t>
     </w:r>
   </w:p>
 </w:ftr>

</xml_diff>

<commit_message>
Restore public downloads and docs to InstallScout 1.8.50.
</commit_message>
<xml_diff>
--- a/docs/InstallScout-guide.docx
+++ b/docs/InstallScout-guide.docx
@@ -23,7 +23,7 @@
           <w:color w:val="5B6B7C"/>
           <w:sz w:val="28"/>
         </w:rPr>
-        <w:t>User guide  ·  version 1.8.51</w:t>
+        <w:t>User guide  ·  version 1.8.50</w:t>
       </w:r>
     </w:p>
     <w:p>
@@ -459,7 +459,7 @@
           <w:color w:val="5B6B7C"/>
           <w:sz w:val="18"/>
         </w:rPr>
-        <w:t>Figure 1. InstallScout 1.8.51 — Drop an installer here, a short introduction, and buttons on two rows.</w:t>
+        <w:t>Figure 1. InstallScout 1.8.50 — Drop an installer here, a short introduction, and buttons on two rows.</w:t>
       </w:r>
     </w:p>
     <w:p>
@@ -3929,7 +3929,7 @@
         <w:color w:val="5B6B7C"/>
         <w:sz w:val="16"/>
       </w:rPr>
-      <w:t>InstallScout 1.8.51  ·  internal user guide  ·  from installer to Intune</w:t>
+      <w:t>InstallScout 1.8.50  ·  internal user guide  ·  from installer to Intune</w:t>
     </w:r>
   </w:p>
 </w:ftr>

</xml_diff>

<commit_message>
Publish 1.8.51 with silent DDPM uninstall (/uninst /Silent).
</commit_message>
<xml_diff>
--- a/docs/InstallScout-guide.docx
+++ b/docs/InstallScout-guide.docx
@@ -23,7 +23,7 @@
           <w:color w:val="5B6B7C"/>
           <w:sz w:val="28"/>
         </w:rPr>
-        <w:t>User guide  ·  version 1.8.50</w:t>
+        <w:t>User guide  ·  version 1.8.51</w:t>
       </w:r>
     </w:p>
     <w:p>
@@ -459,7 +459,7 @@
           <w:color w:val="5B6B7C"/>
           <w:sz w:val="18"/>
         </w:rPr>
-        <w:t>Figure 1. InstallScout 1.8.50 — Drop an installer here, a short introduction, and buttons on two rows.</w:t>
+        <w:t>Figure 1. InstallScout 1.8.51 — Drop an installer here, a short introduction, and buttons on two rows.</w:t>
       </w:r>
     </w:p>
     <w:p>
@@ -3929,7 +3929,7 @@
         <w:color w:val="5B6B7C"/>
         <w:sz w:val="16"/>
       </w:rPr>
-      <w:t>InstallScout 1.8.50  ·  internal user guide  ·  from installer to Intune</w:t>
+      <w:t>InstallScout 1.8.51  ·  internal user guide  ·  from installer to Intune</w:t>
     </w:r>
   </w:p>
 </w:ftr>

</xml_diff>

<commit_message>
Publish 1.8.52 with GitHub update check in About.
</commit_message>
<xml_diff>
--- a/docs/InstallScout-guide.docx
+++ b/docs/InstallScout-guide.docx
@@ -23,7 +23,7 @@
           <w:color w:val="5B6B7C"/>
           <w:sz w:val="28"/>
         </w:rPr>
-        <w:t>User guide  ·  version 1.8.51</w:t>
+        <w:t>User guide  ·  version 1.8.52</w:t>
       </w:r>
     </w:p>
     <w:p>
@@ -459,7 +459,7 @@
           <w:color w:val="5B6B7C"/>
           <w:sz w:val="18"/>
         </w:rPr>
-        <w:t>Figure 1. InstallScout 1.8.51 — Drop an installer here, a short introduction, and buttons on two rows.</w:t>
+        <w:t>Figure 1. InstallScout 1.8.52 — Drop an installer here, a short introduction, and buttons on two rows.</w:t>
       </w:r>
     </w:p>
     <w:p>
@@ -3929,7 +3929,7 @@
         <w:color w:val="5B6B7C"/>
         <w:sz w:val="16"/>
       </w:rPr>
-      <w:t>InstallScout 1.8.51  ·  internal user guide  ·  from installer to Intune</w:t>
+      <w:t>InstallScout 1.8.52  ·  internal user guide  ·  from installer to Intune</w:t>
     </w:r>
   </w:p>
 </w:ftr>

</xml_diff>

<commit_message>
Publish 1.8.53 to verify the update checker.
</commit_message>
<xml_diff>
--- a/docs/InstallScout-guide.docx
+++ b/docs/InstallScout-guide.docx
@@ -23,7 +23,7 @@
           <w:color w:val="5B6B7C"/>
           <w:sz w:val="28"/>
         </w:rPr>
-        <w:t>User guide  ·  version 1.8.52</w:t>
+        <w:t>User guide  ·  version 1.8.53</w:t>
       </w:r>
     </w:p>
     <w:p>
@@ -459,7 +459,7 @@
           <w:color w:val="5B6B7C"/>
           <w:sz w:val="18"/>
         </w:rPr>
-        <w:t>Figure 1. InstallScout 1.8.52 — Drop an installer here, a short introduction, and buttons on two rows.</w:t>
+        <w:t>Figure 1. InstallScout 1.8.53 — Drop an installer here, a short introduction, and buttons on two rows.</w:t>
       </w:r>
     </w:p>
     <w:p>
@@ -3929,7 +3929,7 @@
         <w:color w:val="5B6B7C"/>
         <w:sz w:val="16"/>
       </w:rPr>
-      <w:t>InstallScout 1.8.52  ·  internal user guide  ·  from installer to Intune</w:t>
+      <w:t>InstallScout 1.8.53  ·  internal user guide  ·  from installer to Intune</w:t>
     </w:r>
   </w:p>
 </w:ftr>

</xml_diff>

<commit_message>
Publish 1.8.54 download links and detection docs.
</commit_message>
<xml_diff>
--- a/docs/InstallScout-guide.docx
+++ b/docs/InstallScout-guide.docx
@@ -23,7 +23,7 @@
           <w:color w:val="5B6B7C"/>
           <w:sz w:val="28"/>
         </w:rPr>
-        <w:t>User guide  ·  version 1.8.53</w:t>
+        <w:t>User guide  ·  version 1.8.54</w:t>
       </w:r>
     </w:p>
     <w:p>
@@ -459,7 +459,7 @@
           <w:color w:val="5B6B7C"/>
           <w:sz w:val="18"/>
         </w:rPr>
-        <w:t>Figure 1. InstallScout 1.8.53 — Drop an installer here, a short introduction, and buttons on two rows.</w:t>
+        <w:t>Figure 1. InstallScout 1.8.54 — Drop an installer here, a short introduction, and buttons on two rows.</w:t>
       </w:r>
     </w:p>
     <w:p>
@@ -3223,7 +3223,7 @@
           <w:color w:val="1A1A1A"/>
           <w:sz w:val="22"/>
         </w:rPr>
-        <w:t>A trailing Installer, Setup or Bootstrapper word may be absent. A leftover generic word such as Advanced is not used.</w:t>
+        <w:t>A trailing Installer, Setup, Bootstrapper, or Driver word may be absent. Wacom Tablet Driver matches Wacom Tablet.</w:t>
       </w:r>
     </w:p>
     <w:p>
@@ -3929,7 +3929,7 @@
         <w:color w:val="5B6B7C"/>
         <w:sz w:val="16"/>
       </w:rPr>
-      <w:t>InstallScout 1.8.53  ·  internal user guide  ·  from installer to Intune</w:t>
+      <w:t>InstallScout 1.8.54  ·  internal user guide  ·  from installer to Intune</w:t>
     </w:r>
   </w:p>
 </w:ftr>

</xml_diff>

<commit_message>
Point the download page and guides at InstallScout 1.8.55.
</commit_message>
<xml_diff>
--- a/docs/InstallScout-guide.docx
+++ b/docs/InstallScout-guide.docx
@@ -23,7 +23,7 @@
           <w:color w:val="5B6B7C"/>
           <w:sz w:val="28"/>
         </w:rPr>
-        <w:t>User guide  ·  version 1.8.54</w:t>
+        <w:t>User guide  ·  version 1.8.55</w:t>
       </w:r>
     </w:p>
     <w:p>
@@ -459,7 +459,7 @@
           <w:color w:val="5B6B7C"/>
           <w:sz w:val="18"/>
         </w:rPr>
-        <w:t>Figure 1. InstallScout 1.8.54 — Drop an installer here, a short introduction, and buttons on two rows.</w:t>
+        <w:t>Figure 1. InstallScout 1.8.55 — Drop an installer here, a short introduction, and buttons on two rows.</w:t>
       </w:r>
     </w:p>
     <w:p>
@@ -3929,7 +3929,7 @@
         <w:color w:val="5B6B7C"/>
         <w:sz w:val="16"/>
       </w:rPr>
-      <w:t>InstallScout 1.8.54  ·  internal user guide  ·  from installer to Intune</w:t>
+      <w:t>InstallScout 1.8.55  ·  internal user guide  ·  from installer to Intune</w:t>
     </w:r>
   </w:p>
 </w:ftr>

</xml_diff>

<commit_message>
Point the download page and guides at InstallScout 1.8.56.
Co-authored-by: Cursor <cursoragent@cursor.com>
</commit_message>
<xml_diff>
--- a/docs/InstallScout-guide.docx
+++ b/docs/InstallScout-guide.docx
@@ -23,7 +23,7 @@
           <w:color w:val="5B6B7C"/>
           <w:sz w:val="28"/>
         </w:rPr>
-        <w:t>User guide  ·  version 1.8.55</w:t>
+        <w:t>User guide  ·  version 1.8.56</w:t>
       </w:r>
     </w:p>
     <w:p>
@@ -459,7 +459,7 @@
           <w:color w:val="5B6B7C"/>
           <w:sz w:val="18"/>
         </w:rPr>
-        <w:t>Figure 1. InstallScout 1.8.55 — Drop an installer here, a short introduction, and buttons on two rows.</w:t>
+        <w:t>Figure 1. InstallScout 1.8.56 — Drop an installer here, a short introduction, and buttons on two rows.</w:t>
       </w:r>
     </w:p>
     <w:p>
@@ -3929,7 +3929,7 @@
         <w:color w:val="5B6B7C"/>
         <w:sz w:val="16"/>
       </w:rPr>
-      <w:t>InstallScout 1.8.55  ·  internal user guide  ·  from installer to Intune</w:t>
+      <w:t>InstallScout 1.8.56  ·  internal user guide  ·  from installer to Intune</w:t>
     </w:r>
   </w:p>
 </w:ftr>

</xml_diff>